<commit_message>
Cap nhat link GitHub va commit SHA vao file phieu nop bai
</commit_message>
<xml_diff>
--- a/NguyenHoangNam_thuchanhbuoi05.docx
+++ b/NguyenHoangNam_thuchanhbuoi05.docx
@@ -17,7 +17,7 @@
     </w:p>
     <w:p>
       <w:r>
-        <w:t>GitHub: https://github.com/sinhvien/Bo_Thuc_hanh_Julia_2026_10_09    Commit SHA: 587283c</w:t>
+        <w:t>GitHub: https://github.com/namnh9681-sys/NguyenHoangNam_thuchanhbuoi05    Commit SHA: 10f6f8fe31b9cb07e00673ba7de6136c42e0856c</w:t>
       </w:r>
     </w:p>
     <w:p>
@@ -627,7 +627,7 @@
     </w:p>
     <w:p>
       <w:r>
-        <w:t>Đường dẫn CSV kết quả: data/MINI001/ket_qua.csv (và data/N24DCDT051/ket_qua.csv)        Link notebook: TH_2026_10_09_Pluto.jl</w:t>
+        <w:t>Đường dẫn CSV kết quả: data/MINI001/ket_qua.csv (và data/N24DCDT051/ket_qua.csv)        Link notebook: https://github.com/namnh9681-sys/NguyenHoangNam_thuchanhbuoi05/blob/main/TH_2026_10_09_Pluto.jl</w:t>
       </w:r>
     </w:p>
     <w:p>

</xml_diff>